<commit_message>
Troca citações apud por fontes diretas e remove Pastré, Mayen e Vergnaud
Co-Authored-By: Claude Opus 5.5 <noreply@anthropic.com>
Claude-Session: https://claude.ai/code/session_01X1ts6U7UdZeNcXUt2Wpr1X
</commit_message>
<xml_diff>
--- a/artigo-revisado.docx
+++ b/artigo-revisado.docx
@@ -300,7 +300,7 @@
         <w:jc w:val="both"/>
       </w:pPr>
       <w:r>
-        <w:t>Cabe ainda situar o Guia Comentado em relação aos desenvolvimentos mais recentes da Engenharia Didática enquanto referencial teórico-metodológico. Alves e Catarino (2017) discutem a diferença entre a Engenharia Didática clássica, ou de primeira geração, voltada preferencialmente à compreensão dos fenômenos de aprendizagem do estudante e à elaboração de sequências de ensino, e a Engenharia Didática de Formação (EDF), também denominada Engenharia Didática de segunda geração, que desloca o foco para o papel do professor e para os processos de formação profissional docente. Segundo os autores, essa segunda perspectiva, fundamentada nas contribuições de Perrin-Glorian (2011 apud Alves; Catarino, 2017) e de Pastré, Mayen e Vergnaud (2006 apud Alves; Catarino, 2017), reconhece que a apropriação de dispositivos didáticos pelo professor depende das condições concretas de seu trabalho, e não apenas da transposição de situações previamente validadas junto aos alunos.</w:t>
+        <w:t>Cabe ainda situar o Guia Comentado em relação aos desenvolvimentos mais recentes da Engenharia Didática enquanto referencial teórico-metodológico. Alves e Catarino (2017) discutem a diferença entre a Engenharia Didática clássica, ou de primeira geração, voltada preferencialmente à compreensão dos fenômenos de aprendizagem do estudante e à elaboração de sequências de ensino, e a Engenharia Didática de Formação (EDF), também denominada Engenharia Didática de segunda geração, que desloca o foco para o papel do professor e para os processos de formação profissional docente. Segundo os autores, essa segunda perspectiva, que tem em Perrin-Glorian (2011) uma de suas principais referências, reconhece que a apropriação de dispositivos didáticos pelo professor depende das condições concretas de seu trabalho, e não apenas da transposição de situações previamente validadas junto aos alunos.</w:t>
       </w:r>
     </w:p>
     <w:p>
@@ -310,7 +310,7 @@
         <w:jc w:val="both"/>
       </w:pPr>
       <w:r>
-        <w:t>Esse deslocamento tem sido aprofundado na literatura recente da Educação Matemática. Alves e Cidrão (2021) retomam o percurso da Engenharia Didática e destacam que, a partir da XV Escola de Verão de Didática da Matemática, realizada na França em 2009, Perrin-Glorian abriu espaço para a Engenharia Didática de Desenvolvimento (EDD), voltada à produção de recursos para o ensino regular e à formação de professores que ensinam Matemática. Nessa perspectiva, Perrin-Glorian (2011, p. 24 apud Alves; Cidrão, 2021, p. 2091) afirma que "[...] a engenharia didática não é um objeto acabado, mas um objeto cujo design deve ser capaz de continuar em uso". Os autores apresentam três condições para uma EDD. A primeira é deixar ao professor certa liberdade de ação e observar como ele adapta o documento que recebe. A segunda é que os professores, ao utilizarem os documentos produzidos, procurem reproduzir as condições da aprendizagem, e não a história de uma aula. A terceira é apoiar-se em uma engenharia de primeira geração que possibilite a construção de uma situação fundamental e sua análise (Alves; Cidrão, 2021, p. 2092). Os autores observam, ainda, que a Teoria das Situações Didáticas e a Engenharia Didática não dão conta de todas as situações do trabalho docente, e por isso defendem sua complementaridade com a Didática Profissional, vertente francófona que parte da análise da atividade do professor para construir dispositivos de formação (Alves; Cidrão, 2021, p. 2095).</w:t>
+        <w:t>Esse deslocamento tem sido aprofundado na literatura recente da Educação Matemática. Alves e Cidrão (2021) retomam o percurso da Engenharia Didática e destacam que, a partir da XV Escola de Verão de Didática da Matemática, realizada na França em 2009, Perrin-Glorian abriu espaço para a Engenharia Didática de Desenvolvimento (EDD), voltada à produção de recursos para o ensino regular e à formação de professores que ensinam Matemática. Nessa perspectiva, Perrin-Glorian (2011) compreende a engenharia didática como um objeto que não está acabado, cujo desenho deve continuar em uso e em transformação à medida que é apropriado pelos professores. A autora estabelece três condições para uma EDD, retomadas por Alves e Cidrão (2021). A primeira é deixar ao professor certa liberdade de ação e observar como ele adapta o documento que recebe. A segunda é que os professores, ao utilizarem os documentos produzidos, procurem reproduzir as condições da aprendizagem, e não a história de uma aula. A terceira é apoiar-se em uma engenharia de primeira geração que possibilite a construção de uma situação fundamental e sua análise (Perrin-Glorian, 2011; Alves; Cidrão, 2021). Alves e Cidrão (2021) observam, ainda, que a Teoria das Situações Didáticas e a Engenharia Didática não dão conta de todas as situações do trabalho docente, e por isso defendem sua complementaridade com a Didática Profissional, vertente francófona que parte da análise da atividade do professor para construir dispositivos de formação (Alves; Cidrão, 2021, p. 2095).</w:t>
       </w:r>
     </w:p>
     <w:p>
@@ -320,7 +320,7 @@
         <w:jc w:val="both"/>
       </w:pPr>
       <w:r>
-        <w:t>No campo da formação inicial, Sousa, Azevedo e Alves (2021) articulam a Engenharia Didática à Teoria das Situações Didáticas para elaborar situações didáticas de Geometria Analítica com o software GeoGebra, destinadas a licenciandos em Matemática. Os autores assumem que a Engenharia Didática "[...] pode ser entendida tanto como uma metodologia de pesquisa específica, quanto como uma sequência de aulas ou atividades concebidas e organizadas de forma coerente" (Leivas; Gobbi, 2014, p. 184 apud Sousa; Azevedo; Alves, 2021, p. 365). Por se tratar de uma pesquisa em andamento, trabalham apenas com as análises preliminares e a análise a priori, com o propósito de desenvolver a percepção do professor sobre os comportamentos que podem ser esperados dos alunos. Concluem que a Engenharia Didática, articulada à Teoria das Situações Didáticas, orienta o trabalho docente de modo que o professor se torne um investigador que reflete sobre a própria prática (Sousa; Azevedo; Alves, 2021, p. 376).</w:t>
+        <w:t>No campo da formação inicial, Sousa, Azevedo e Alves (2021) articulam a Engenharia Didática à Teoria das Situações Didáticas para elaborar situações didáticas de Geometria Analítica com o software GeoGebra, destinadas a licenciandos em Matemática. Os autores assumem que a Engenharia Didática "[...] pode ser entendida tanto como uma metodologia de pesquisa específica, quanto como uma sequência de aulas ou atividades concebidas e organizadas de forma coerente" (Leivas; Gobbi, 2014, p. 184). Por se tratar de uma pesquisa em andamento, trabalham apenas com as análises preliminares e a análise a priori, com o propósito de desenvolver a percepção do professor sobre os comportamentos que podem ser esperados dos alunos. Concluem que a Engenharia Didática, articulada à Teoria das Situações Didáticas, orienta o trabalho docente de modo que o professor se torne um investigador que reflete sobre a própria prática (Sousa; Azevedo; Alves, 2021, p. 376).</w:t>
       </w:r>
     </w:p>
     <w:p>
@@ -330,7 +330,7 @@
         <w:jc w:val="both"/>
       </w:pPr>
       <w:r>
-        <w:t>Em diálogo com essas produções, o Guia Comentado aproxima-se dos pressupostos da EDF e da EDD por ter como finalidade a formação do professor, e não a aplicação direta de uma sequência de ensino em sala de aula. Em consonância com a primeira condição descrita por Alves e Cidrão (2021), o Guia preserva a liberdade de ação docente: os comentários e as sugestões de aprimoramento que acompanham os planos convidam o professor a adaptar as propostas à sua realidade, e não a reproduzi-las. Assim como em Sousa, Azevedo e Alves (2021), o Guia dá destaque às análises prévias e à concepção e análise a priori como ferramentas de planejamento e considera o professor como sujeito que investiga e reflete sobre a própria prática.</w:t>
+        <w:t>Em diálogo com essas produções, o Guia Comentado aproxima-se dos pressupostos da EDF e da EDD por ter como finalidade a formação do professor, e não a aplicação direta de uma sequência de ensino em sala de aula. Em consonância com a primeira condição apresentada por Perrin-Glorian (2011), o Guia preserva a liberdade de ação docente: os comentários e as sugestões de aprimoramento que acompanham os planos convidam o professor a adaptar as propostas à sua realidade, e não a reproduzi-las. Assim como em Sousa, Azevedo e Alves (2021), o Guia dá destaque às análises prévias e à concepção e análise a priori como ferramentas de planejamento e considera o professor como sujeito que investiga e reflete sobre a própria prática.</w:t>
       </w:r>
     </w:p>
     <w:p>
@@ -340,7 +340,7 @@
         <w:jc w:val="both"/>
       </w:pPr>
       <w:r>
-        <w:t>Há, contudo, distanciamentos que precisam ser explicitados. Diferentemente de uma EDD em sentido estrito, o Guia não parte da construção de uma situação fundamental validada por uma engenharia de primeira geração, nem acompanha o modo como os professores adaptam o material em suas aulas. Seu ponto de partida são planos de aula já publicados, analisados documentalmente. Considerando a distinção entre tarefa prescrita e atividade real, utilizada pela Didática Profissional (Leplat, 2013 apud Alves; Cidrão, 2021, p. 2090), esses planos correspondem ao trabalho prescrito ao professor, e não à atividade efetivamente realizada em sala de aula. Além disso, a validação do Guia, apresentada adiante, não corresponde à validação interna da Engenharia Didática, "[...] baseada no confronto entre uma análise a priori e uma análise a posteriori" (Artigue, 2002, p. 63 apud Alves; Cidrão, 2021, p. 2087), mas à avaliação do produto educacional por seus possíveis usuários. Por essas razões, o Guia pode ser compreendido como um recurso formativo de iniciação à Engenharia Didática, em diálogo com a EDF e a EDD, sem se confundir com uma engenharia de desenvolvimento propriamente dita.</w:t>
+        <w:t>Há, contudo, distanciamentos que precisam ser explicitados. Diferentemente de uma EDD em sentido estrito, o Guia não parte da construção de uma situação fundamental validada por uma engenharia de primeira geração, nem acompanha o modo como os professores adaptam o material em suas aulas. Seu ponto de partida são planos de aula já publicados, analisados documentalmente. Considerando a distinção entre tarefa prescrita e atividade real, discutida por Alves e Cidrão (2021) no âmbito da Didática Profissional, esses planos correspondem ao trabalho prescrito ao professor, e não à atividade efetivamente realizada em sala de aula. Além disso, a validação do Guia, apresentada adiante, não corresponde à validação interna da Engenharia Didática, que, segundo Artigue (1996), se apoia no confronto entre a análise a priori e a análise a posteriori, mas à avaliação do produto educacional por seus possíveis usuários. Por essas razões, o Guia pode ser compreendido como um recurso formativo de iniciação à Engenharia Didática, em diálogo com a EDF e a EDD, sem se confundir com uma engenharia de desenvolvimento propriamente dita.</w:t>
       </w:r>
     </w:p>
     <w:p>
@@ -2749,7 +2749,7 @@
         <w:jc w:val="both"/>
       </w:pPr>
       <w:r>
-        <w:t>Cabe reconhecer, contudo, que os dados apresentados dizem respeito, mais precisamente, à percepção dos participantes da oficina sobre a clareza, a aplicabilidade e o potencial formativo do Guia, e não a uma comprovação direta de sua replicabilidade em diferentes contextos escolares. Conforme discutem Perrin-Glorian (2011 apud Alves; Catarino, 2017) e Alves e Catarino (2017), a apropriação de dispositivos oriundos da Engenharia Didática pelo professor depende das condições concretas de seu trabalho, o que inclui variáveis como o perfil da turma, o tempo disponível para planejamento, a infraestrutura escolar e a trajetória formativa de cada docente, fatores que não foram objeto direto de investigação nesta pesquisa. A avaliação positiva registrada refere-se, portanto, a um grupo específico de vinte participantes, majoritariamente licenciandos, reunidos em uma oficina de quatro horas em uma única instituição, o que delimita o alcance das inferências aqui apresentadas. Investigações futuras, voltadas ao acompanhamento da aplicação do Guia em contextos de formação continuada de maior duração e em diferentes realidades escolares, são necessárias para que se possa discutir com mais propriedade sua replicabilidade.</w:t>
+        <w:t>Cabe reconhecer, contudo, que os dados apresentados dizem respeito, mais precisamente, à percepção dos participantes da oficina sobre a clareza, a aplicabilidade e o potencial formativo do Guia, e não a uma comprovação direta de sua replicabilidade em diferentes contextos escolares. Conforme discutem Perrin-Glorian (2011) e Alves e Catarino (2017), a apropriação de dispositivos oriundos da Engenharia Didática pelo professor depende das condições concretas de seu trabalho, o que inclui variáveis como o perfil da turma, o tempo disponível para planejamento, a infraestrutura escolar e a trajetória formativa de cada docente, fatores que não foram objeto direto de investigação nesta pesquisa. A avaliação positiva registrada refere-se, portanto, a um grupo específico de vinte participantes, majoritariamente licenciandos, reunidos em uma oficina de quatro horas em uma única instituição, o que delimita o alcance das inferências aqui apresentadas. Investigações futuras, voltadas ao acompanhamento da aplicação do Guia em contextos de formação continuada de maior duração e em diferentes realidades escolares, são necessárias para que se possa discutir com mais propriedade sua replicabilidade.</w:t>
       </w:r>
     </w:p>
     <w:p>
@@ -2759,7 +2759,7 @@
         <w:jc w:val="both"/>
       </w:pPr>
       <w:r>
-        <w:t>Nessa direção, a Engenharia Didática de Desenvolvimento aponta um caminho possível para a continuidade desta investigação. Acompanhar como professores adaptam o Guia em suas próprias aulas, conforme a primeira condição descrita por Perrin-Glorian (2009 apud Alves; Cidrão, 2021), e analisar essa atividade com base na Didática Profissional permitiria ir além da percepção sobre o material e investigar seus efeitos sobre o trabalho docente. Permitiria, também, realizar em sala de aula o confronto entre análise a priori e análise a posteriori que caracteriza a validação interna da Engenharia Didática (Artigue, 2002 apud Alves; Cidrão, 2021).</w:t>
+        <w:t>Nessa direção, a Engenharia Didática de Desenvolvimento aponta um caminho possível para a continuidade desta investigação. Acompanhar como professores adaptam o Guia em suas próprias aulas, conforme a primeira condição apresentada por Perrin-Glorian (2011), e analisar essa atividade com base na Didática Profissional permitiria ir além da percepção sobre o material e investigar seus efeitos sobre o trabalho docente. Permitiria, também, realizar em sala de aula o confronto entre análise a priori e análise a posteriori que caracteriza a validação interna da Engenharia Didática (Artigue, 1996).</w:t>
       </w:r>
     </w:p>
     <w:p>
@@ -3145,16 +3145,16 @@
         <w:jc w:val="left"/>
       </w:pPr>
       <w:r>
-        <w:t xml:space="preserve">ARTIGUE, M. Engenharia didáctica. In: BRUN, J. (org.). </w:t>
+        <w:t xml:space="preserve">ARTIGUE, M. Engenharia Didática. In: BRUN, J. </w:t>
       </w:r>
       <w:r>
         <w:rPr>
           <w:b/>
         </w:rPr>
-        <w:t>Didáctica das matemáticas</w:t>
-      </w:r>
-      <w:r>
-        <w:t>. Tradução de Maria José Figueiredo. Lisboa: Instituto Piaget, 1996. p. 193-217.</w:t>
+        <w:t>Didática das Matemáticas</w:t>
+      </w:r>
+      <w:r>
+        <w:t>. Tradução: FIGUEIREDO, M. J. Lisboa: Instituto Piaget, Cap. 4. p. 193-217, 1996.</w:t>
       </w:r>
     </w:p>
     <w:p>
@@ -3397,6 +3397,39 @@
         <w:jc w:val="left"/>
       </w:pPr>
       <w:r>
+        <w:t xml:space="preserve">LEIVAS, J. C. P.; GOBBI, J. A. O software GeoGebra e a Engenharia Didática no estudo de áreas e perímetros de figuras planas. </w:t>
+      </w:r>
+      <w:r>
+        <w:rPr>
+          <w:b/>
+        </w:rPr>
+        <w:t>Revista Brasileira de Ensino de Ciências e Tecnologia</w:t>
+      </w:r>
+      <w:r>
+        <w:t xml:space="preserve">, Curitiba, v. 7, n. 1, p. 182-199, 2014. Disponível em: https://periodicos.utfpr.edu.br/rbect/article/view/1521. Acesso em: </w:t>
+      </w:r>
+      <w:r>
+        <w:rPr>
+          <w:highlight w:val="yellow"/>
+        </w:rPr>
+        <w:t>[data]</w:t>
+      </w:r>
+      <w:r>
+        <w:t xml:space="preserve">. </w:t>
+      </w:r>
+      <w:r>
+        <w:rPr>
+          <w:highlight w:val="yellow"/>
+        </w:rPr>
+        <w:t>[CONFERIR p. 184 da citação]</w:t>
+      </w:r>
+    </w:p>
+    <w:p>
+      <w:pPr>
+        <w:spacing w:line="240" w:lineRule="auto" w:after="240"/>
+        <w:jc w:val="left"/>
+      </w:pPr>
+      <w:r>
         <w:t xml:space="preserve">LIBÂNEO, J. C. </w:t>
       </w:r>
       <w:r>
@@ -3746,6 +3779,24 @@
       </w:r>
       <w:r>
         <w:t>: uma análise da influência francesa. Belo Horizonte: Autêntica, 2002.</w:t>
+      </w:r>
+    </w:p>
+    <w:p>
+      <w:pPr>
+        <w:spacing w:line="240" w:lineRule="auto" w:after="240"/>
+        <w:jc w:val="left"/>
+      </w:pPr>
+      <w:r>
+        <w:t xml:space="preserve">PERRIN-GLORIAN, M.-J. L'ingénierie didactique à l'interface de la recherche avec l'enseignement: développement de ressources et formation des enseignants. In: MARGOLINAS, C. et al. (ed.). </w:t>
+      </w:r>
+      <w:r>
+        <w:rPr>
+          <w:b/>
+        </w:rPr>
+        <w:t>En amont et en aval des ingénieries didactiques</w:t>
+      </w:r>
+      <w:r>
+        <w:t>. Grenoble: La Pensée Sauvage, 2011. p. 57-78.</w:t>
       </w:r>
     </w:p>
     <w:p>

</xml_diff>